<commit_message>
feat: hoàn thiện giao diện trang chủ
</commit_message>
<xml_diff>
--- a/baocao.docx
+++ b/baocao.docx
@@ -2112,9 +2112,64 @@
     <w:p>
       <w:pPr>
         <w:pStyle w:val="Heading3"/>
+        <w:rPr>
+          <w:lang w:val="vi-VN"/>
+        </w:rPr>
       </w:pPr>
       <w:r>
         <w:t>Mô hình ERD</w:t>
+      </w:r>
+    </w:p>
+    <w:p>
+      <w:pPr>
+        <w:rPr>
+          <w:lang w:val="vi-VN"/>
+        </w:rPr>
+      </w:pPr>
+      <w:r>
+        <w:rPr>
+          <w:lang w:val="vi-VN"/>
+        </w:rPr>
+        <w:drawing>
+          <wp:inline distT="0" distB="0" distL="0" distR="0" wp14:anchorId="1EEAE99B" wp14:editId="1CD0D27E">
+            <wp:extent cx="5580380" cy="4031615"/>
+            <wp:effectExtent l="19050" t="19050" r="20320" b="26035"/>
+            <wp:docPr id="509271290" name="Picture 1"/>
+            <wp:cNvGraphicFramePr>
+              <a:graphicFrameLocks xmlns:a="http://schemas.openxmlformats.org/drawingml/2006/main" noChangeAspect="1"/>
+            </wp:cNvGraphicFramePr>
+            <a:graphic xmlns:a="http://schemas.openxmlformats.org/drawingml/2006/main">
+              <a:graphicData uri="http://schemas.openxmlformats.org/drawingml/2006/picture">
+                <pic:pic xmlns:pic="http://schemas.openxmlformats.org/drawingml/2006/picture">
+                  <pic:nvPicPr>
+                    <pic:cNvPr id="509271290" name=""/>
+                    <pic:cNvPicPr/>
+                  </pic:nvPicPr>
+                  <pic:blipFill>
+                    <a:blip r:embed="rId9"/>
+                    <a:stretch>
+                      <a:fillRect/>
+                    </a:stretch>
+                  </pic:blipFill>
+                  <pic:spPr>
+                    <a:xfrm>
+                      <a:off x="0" y="0"/>
+                      <a:ext cx="5580380" cy="4031615"/>
+                    </a:xfrm>
+                    <a:prstGeom prst="rect">
+                      <a:avLst/>
+                    </a:prstGeom>
+                    <a:ln>
+                      <a:solidFill>
+                        <a:schemeClr val="tx1"/>
+                      </a:solidFill>
+                    </a:ln>
+                  </pic:spPr>
+                </pic:pic>
+              </a:graphicData>
+            </a:graphic>
+          </wp:inline>
+        </w:drawing>
       </w:r>
     </w:p>
     <w:p>
@@ -2570,6 +2625,7 @@
         <w:rPr>
           <w:lang w:val="vi-VN"/>
         </w:rPr>
+        <w:lastRenderedPageBreak/>
         <w:t>Tên t</w:t>
       </w:r>
       <w:r>
@@ -3094,7 +3150,6 @@
               <w:jc w:val="left"/>
             </w:pPr>
             <w:r>
-              <w:lastRenderedPageBreak/>
               <w:t>5</w:t>
             </w:r>
           </w:p>
@@ -3673,6 +3728,7 @@
               <w:jc w:val="left"/>
             </w:pPr>
             <w:r>
+              <w:lastRenderedPageBreak/>
               <w:t>2</w:t>
             </w:r>
           </w:p>
@@ -4185,7 +4241,6 @@
         <w:rPr>
           <w:lang w:val="vi-VN"/>
         </w:rPr>
-        <w:lastRenderedPageBreak/>
         <w:t xml:space="preserve">Mô tả thực thể: </w:t>
       </w:r>
       <w:r>
@@ -4781,7 +4836,11 @@
         <w:t>D</w:t>
       </w:r>
       <w:r>
-        <w:t>ùng để lưu trữ thông tin về các đơn vị vận chuyển tham gia vào quá trình giao hàng của hệ thống. Mỗi đơn vị vận chuyển được xác định bởi ShipperID và có các thông tin như tên đơn vị vận chuyển và số điện thoại liên hệ. Thông tin trong thực thể này được sử dụng để xác định đơn vị chịu trách nhiệm vận chuyển cho từng đơn hàng.</w:t>
+        <w:t xml:space="preserve">ùng để lưu trữ thông tin về các đơn vị vận chuyển tham gia vào quá trình giao hàng của hệ thống. Mỗi đơn vị vận chuyển được xác định bởi </w:t>
+      </w:r>
+      <w:r>
+        <w:lastRenderedPageBreak/>
+        <w:t>ShipperID và có các thông tin như tên đơn vị vận chuyển và số điện thoại liên hệ. Thông tin trong thực thể này được sử dụng để xác định đơn vị chịu trách nhiệm vận chuyển cho từng đơn hàng.</w:t>
       </w:r>
     </w:p>
     <w:tbl>
@@ -5179,7 +5238,6 @@
         <w:rPr>
           <w:lang w:val="vi-VN"/>
         </w:rPr>
-        <w:lastRenderedPageBreak/>
         <w:t xml:space="preserve">Mô tả thực thể: </w:t>
       </w:r>
       <w:r>
@@ -5798,6 +5856,7 @@
               <w:jc w:val="left"/>
             </w:pPr>
             <w:r>
+              <w:lastRenderedPageBreak/>
               <w:t>7</w:t>
             </w:r>
           </w:p>
@@ -6166,11 +6225,7 @@
         <w:t>D</w:t>
       </w:r>
       <w:r>
-        <w:t xml:space="preserve">ùng để lưu trữ thông tin hình ảnh của sản phẩm. Mỗi hình ảnh được xác định bởi ProductImageID và liên kết với một sản phẩm thông qua ProductID. Thực thể lưu tên hoặc đường dẫn hình ảnh, nội dung mô tả hình ảnh, trạng </w:t>
-      </w:r>
-      <w:r>
-        <w:lastRenderedPageBreak/>
-        <w:t>thái hình ảnh chính và thứ tự hiển thị. Một sản phẩm có thể có nhiều hình ảnh khác nhau, giúp hệ thống hiển thị sản phẩm đầy đủ và trực quan hơn.</w:t>
+        <w:t>ùng để lưu trữ thông tin hình ảnh của sản phẩm. Mỗi hình ảnh được xác định bởi ProductImageID và liên kết với một sản phẩm thông qua ProductID. Thực thể lưu tên hoặc đường dẫn hình ảnh, nội dung mô tả hình ảnh, trạng thái hình ảnh chính và thứ tự hiển thị. Một sản phẩm có thể có nhiều hình ảnh khác nhau, giúp hệ thống hiển thị sản phẩm đầy đủ và trực quan hơn.</w:t>
       </w:r>
     </w:p>
     <w:tbl>
@@ -6704,6 +6759,7 @@
               <w:jc w:val="left"/>
             </w:pPr>
             <w:r>
+              <w:lastRenderedPageBreak/>
               <w:t>6</w:t>
             </w:r>
           </w:p>
@@ -7204,7 +7260,6 @@
               <w:jc w:val="left"/>
             </w:pPr>
             <w:r>
-              <w:lastRenderedPageBreak/>
               <w:t>4</w:t>
             </w:r>
           </w:p>
@@ -7717,21 +7772,26 @@
               <w:cnfStyle w:val="000000000000" w:firstRow="0" w:lastRow="0" w:firstColumn="0" w:lastColumn="0" w:oddVBand="0" w:evenVBand="0" w:oddHBand="0" w:evenHBand="0" w:firstRowFirstColumn="0" w:firstRowLastColumn="0" w:lastRowFirstColumn="0" w:lastRowLastColumn="0"/>
             </w:pPr>
             <w:r>
-              <w:t>Đơn giá sản phẩm tại thời điểm đặt hàng</w:t>
-            </w:r>
-          </w:p>
-        </w:tc>
-        <w:tc>
-          <w:tcPr>
-            <w:tcW w:w="0" w:type="auto"/>
-            <w:hideMark/>
-          </w:tcPr>
-          <w:p>
-            <w:pPr>
-              <w:spacing w:after="160" w:line="259" w:lineRule="auto"/>
-              <w:cnfStyle w:val="000000000000" w:firstRow="0" w:lastRow="0" w:firstColumn="0" w:lastColumn="0" w:oddVBand="0" w:evenVBand="0" w:oddHBand="0" w:evenHBand="0" w:firstRowFirstColumn="0" w:firstRowLastColumn="0" w:lastRowFirstColumn="0" w:lastRowLastColumn="0"/>
-            </w:pPr>
-            <w:r>
+              <w:t xml:space="preserve">Đơn giá sản phẩm tại thời </w:t>
+            </w:r>
+            <w:r>
+              <w:lastRenderedPageBreak/>
+              <w:t>điểm đặt hàng</w:t>
+            </w:r>
+          </w:p>
+        </w:tc>
+        <w:tc>
+          <w:tcPr>
+            <w:tcW w:w="0" w:type="auto"/>
+            <w:hideMark/>
+          </w:tcPr>
+          <w:p>
+            <w:pPr>
+              <w:spacing w:after="160" w:line="259" w:lineRule="auto"/>
+              <w:cnfStyle w:val="000000000000" w:firstRow="0" w:lastRow="0" w:firstColumn="0" w:lastColumn="0" w:oddVBand="0" w:evenVBand="0" w:oddHBand="0" w:evenHBand="0" w:firstRowFirstColumn="0" w:firstRowLastColumn="0" w:lastRowFirstColumn="0" w:lastRowLastColumn="0"/>
+            </w:pPr>
+            <w:r>
+              <w:lastRenderedPageBreak/>
               <w:t>DECIMAL(12,2)</w:t>
             </w:r>
           </w:p>
@@ -7948,79 +8008,79 @@
         <w:pStyle w:val="NOIDUNG"/>
       </w:pPr>
       <w:r>
+        <w:t>Tác nhân bên ngoài của hệ thống là Khách hàng. Khách hàng tương tác với hệ thống để thực hiện các hoạt động mua hàng và cung cấp các thông tin cần thiết cho quá trình đặt hàng.</w:t>
+      </w:r>
+    </w:p>
+    <w:p>
+      <w:pPr>
+        <w:pStyle w:val="NOIDUNG"/>
+      </w:pPr>
+      <w:r>
+        <w:t>Từ Khách hàng đến Hệ thống, có các luồng dữ liệu chính gồm:</w:t>
+      </w:r>
+    </w:p>
+    <w:p>
+      <w:pPr>
+        <w:pStyle w:val="NOIDUNG"/>
+      </w:pPr>
+      <w:r>
+        <w:t>Yêu cầu xem sản phẩm: Khách hàng gửi yêu cầu xem danh sách hoặc thông tin sản phẩm cần mua.</w:t>
+      </w:r>
+    </w:p>
+    <w:p>
+      <w:pPr>
+        <w:pStyle w:val="NOIDUNG"/>
+      </w:pPr>
+      <w:r>
+        <w:t>Thông tin khách hàng: Khách hàng cung cấp các thông tin cần thiết để thực hiện đặt hàng.</w:t>
+      </w:r>
+    </w:p>
+    <w:p>
+      <w:pPr>
+        <w:pStyle w:val="NOIDUNG"/>
+      </w:pPr>
+      <w:r>
+        <w:t>Thông tin đặt hàng: Khách hàng gửi thông tin về sản phẩm và số lượng cần đặt.</w:t>
+      </w:r>
+    </w:p>
+    <w:p>
+      <w:pPr>
+        <w:pStyle w:val="NOIDUNG"/>
+      </w:pPr>
+      <w:r>
+        <w:t>Từ Hệ thống đến Khách hàng, hệ thống trả về các luồng dữ liệu gồm:</w:t>
+      </w:r>
+    </w:p>
+    <w:p>
+      <w:pPr>
+        <w:pStyle w:val="NOIDUNG"/>
+      </w:pPr>
+      <w:r>
+        <w:t>Thông tin sản phẩm: Cung cấp thông tin về sản phẩm để khách hàng xem và lựa chọn.</w:t>
+      </w:r>
+    </w:p>
+    <w:p>
+      <w:pPr>
+        <w:pStyle w:val="NOIDUNG"/>
+      </w:pPr>
+      <w:r>
+        <w:t>Kết quả đặt hàng: Thông báo kết quả xử lý yêu cầu đặt hàng.</w:t>
+      </w:r>
+    </w:p>
+    <w:p>
+      <w:pPr>
+        <w:pStyle w:val="NOIDUNG"/>
+      </w:pPr>
+      <w:r>
+        <w:t>Xác nhận đơn hàng: Cung cấp thông tin xác nhận sau khi đơn hàng được tạo thành công.</w:t>
+      </w:r>
+    </w:p>
+    <w:p>
+      <w:pPr>
+        <w:pStyle w:val="NOIDUNG"/>
+      </w:pPr>
+      <w:r>
         <w:lastRenderedPageBreak/>
-        <w:t>Tác nhân bên ngoài của hệ thống là Khách hàng. Khách hàng tương tác với hệ thống để thực hiện các hoạt động mua hàng và cung cấp các thông tin cần thiết cho quá trình đặt hàng.</w:t>
-      </w:r>
-    </w:p>
-    <w:p>
-      <w:pPr>
-        <w:pStyle w:val="NOIDUNG"/>
-      </w:pPr>
-      <w:r>
-        <w:t>Từ Khách hàng đến Hệ thống, có các luồng dữ liệu chính gồm:</w:t>
-      </w:r>
-    </w:p>
-    <w:p>
-      <w:pPr>
-        <w:pStyle w:val="NOIDUNG"/>
-      </w:pPr>
-      <w:r>
-        <w:t>Yêu cầu xem sản phẩm: Khách hàng gửi yêu cầu xem danh sách hoặc thông tin sản phẩm cần mua.</w:t>
-      </w:r>
-    </w:p>
-    <w:p>
-      <w:pPr>
-        <w:pStyle w:val="NOIDUNG"/>
-      </w:pPr>
-      <w:r>
-        <w:t>Thông tin khách hàng: Khách hàng cung cấp các thông tin cần thiết để thực hiện đặt hàng.</w:t>
-      </w:r>
-    </w:p>
-    <w:p>
-      <w:pPr>
-        <w:pStyle w:val="NOIDUNG"/>
-      </w:pPr>
-      <w:r>
-        <w:t>Thông tin đặt hàng: Khách hàng gửi thông tin về sản phẩm và số lượng cần đặt.</w:t>
-      </w:r>
-    </w:p>
-    <w:p>
-      <w:pPr>
-        <w:pStyle w:val="NOIDUNG"/>
-      </w:pPr>
-      <w:r>
-        <w:t>Từ Hệ thống đến Khách hàng, hệ thống trả về các luồng dữ liệu gồm:</w:t>
-      </w:r>
-    </w:p>
-    <w:p>
-      <w:pPr>
-        <w:pStyle w:val="NOIDUNG"/>
-      </w:pPr>
-      <w:r>
-        <w:t>Thông tin sản phẩm: Cung cấp thông tin về sản phẩm để khách hàng xem và lựa chọn.</w:t>
-      </w:r>
-    </w:p>
-    <w:p>
-      <w:pPr>
-        <w:pStyle w:val="NOIDUNG"/>
-      </w:pPr>
-      <w:r>
-        <w:t>Kết quả đặt hàng: Thông báo kết quả xử lý yêu cầu đặt hàng.</w:t>
-      </w:r>
-    </w:p>
-    <w:p>
-      <w:pPr>
-        <w:pStyle w:val="NOIDUNG"/>
-      </w:pPr>
-      <w:r>
-        <w:t>Xác nhận đơn hàng: Cung cấp thông tin xác nhận sau khi đơn hàng được tạo thành công.</w:t>
-      </w:r>
-    </w:p>
-    <w:p>
-      <w:pPr>
-        <w:pStyle w:val="NOIDUNG"/>
-      </w:pPr>
-      <w:r>
         <w:t>Như vậy, DFD mức ngữ cảnh xác định ranh giới của hệ thống và thể hiện quá trình trao đổi dữ liệu giữa Khách hàng và Hệ thống website bán hàng trực tuyến. Các thành phần xử lý bên trong như products, customers, orders, orderdetail, shippers và cơ sở dữ liệu MySQL không được thể hiện ở mức này mà sẽ được phân tích chi tiết ở các mức DFD tiếp theo.</w:t>
       </w:r>
     </w:p>
@@ -8042,7 +8102,6 @@
           <w:noProof/>
           <w:lang w:val="vi-VN"/>
         </w:rPr>
-        <w:lastRenderedPageBreak/>
         <w:drawing>
           <wp:inline distT="0" distB="0" distL="0" distR="0" wp14:anchorId="0DCAA5E4" wp14:editId="19626597">
             <wp:extent cx="5580380" cy="2350135"/>
@@ -8059,7 +8118,7 @@
                     <pic:cNvPicPr/>
                   </pic:nvPicPr>
                   <pic:blipFill>
-                    <a:blip r:embed="rId9"/>
+                    <a:blip r:embed="rId10"/>
                     <a:stretch>
                       <a:fillRect/>
                     </a:stretch>
@@ -8101,10 +8160,34 @@
     <w:p>
       <w:pPr>
         <w:pStyle w:val="Heading2"/>
+        <w:rPr>
+          <w:lang w:val="vi-VN"/>
+        </w:rPr>
       </w:pPr>
       <w:r>
         <w:t>Thiết kế giao diện</w:t>
       </w:r>
+    </w:p>
+    <w:p>
+      <w:pPr>
+        <w:pStyle w:val="Heading3"/>
+        <w:rPr>
+          <w:lang w:val="vi-VN"/>
+        </w:rPr>
+      </w:pPr>
+      <w:r>
+        <w:rPr>
+          <w:lang w:val="vi-VN"/>
+        </w:rPr>
+        <w:t>Sơ đồ website</w:t>
+      </w:r>
+    </w:p>
+    <w:p>
+      <w:pPr>
+        <w:rPr>
+          <w:lang w:val="vi-VN"/>
+        </w:rPr>
+      </w:pPr>
     </w:p>
     <w:p>
       <w:pPr>

</xml_diff>